<commit_message>
add java compile script
</commit_message>
<xml_diff>
--- a/programming/lab_2/Lab2 prog.docx
+++ b/programming/lab_2/Lab2 prog.docx
@@ -305,8 +305,11 @@
     </w:p>
     <w:p>
       <w:pPr>
+        <w:tabs>
+          <w:tab w:val="center" w:pos="4535"/>
+          <w:tab w:val="left" w:pos="7005"/>
+        </w:tabs>
         <w:spacing w:line="360" w:lineRule="auto"/>
-        <w:jc w:val="center"/>
         <w:rPr>
           <w:rFonts w:ascii="Times New Roman" w:eastAsia="Arial" w:hAnsi="Times New Roman" w:cs="Times New Roman"/>
           <w:b/>
@@ -323,7 +326,7 @@
           <w:sz w:val="32"/>
           <w:szCs w:val="32"/>
         </w:rPr>
-        <w:t>Вариант №</w:t>
+        <w:tab/>
       </w:r>
       <w:r>
         <w:rPr>
@@ -333,6 +336,16 @@
           <w:sz w:val="32"/>
           <w:szCs w:val="32"/>
         </w:rPr>
+        <w:t>Вариант №</w:t>
+      </w:r>
+      <w:r>
+        <w:rPr>
+          <w:rFonts w:ascii="Times New Roman" w:eastAsia="Arial" w:hAnsi="Times New Roman" w:cs="Times New Roman"/>
+          <w:b/>
+          <w:bCs/>
+          <w:sz w:val="32"/>
+          <w:szCs w:val="32"/>
+        </w:rPr>
         <w:t>21005</w:t>
       </w:r>
     </w:p>
@@ -383,7 +396,7 @@
         <w:rPr>
           <w:rFonts w:ascii="Times New Roman" w:hAnsi="Times New Roman" w:cs="Times New Roman"/>
         </w:rPr>
-        <w:t>Дворкин Борис Александрович</w:t>
+        <w:t>Миронов Иван Николаевич</w:t>
       </w:r>
     </w:p>
     <w:p>
@@ -1301,489 +1314,236 @@
     </w:p>
     <w:p>
       <w:pPr>
-        <w:suppressAutoHyphens w:val="0"/>
-        <w:autoSpaceDN/>
-        <w:spacing w:before="100" w:beforeAutospacing="1" w:after="100" w:afterAutospacing="1"/>
         <w:rPr>
           <w:rFonts w:ascii="Times New Roman" w:eastAsia="Times New Roman" w:hAnsi="Times New Roman" w:cs="Times New Roman"/>
           <w:kern w:val="0"/>
-          <w:lang w:eastAsia="ru-RU" w:bidi="ar-SA"/>
+          <w:lang w:val="en-RU" w:eastAsia="ru-RU" w:bidi="ar-SA"/>
         </w:rPr>
       </w:pPr>
       <w:r>
         <w:rPr>
           <w:rFonts w:ascii="Times New Roman" w:eastAsia="Times New Roman" w:hAnsi="Times New Roman" w:cs="Times New Roman"/>
           <w:kern w:val="0"/>
-          <w:lang w:eastAsia="ru-RU" w:bidi="ar-SA"/>
-        </w:rPr>
-        <w:t xml:space="preserve">На основе базового класса </w:t>
-      </w:r>
-      <w:proofErr w:type="spellStart"/>
-      <w:r>
+          <w:lang w:val="en-RU" w:eastAsia="ru-RU" w:bidi="ar-SA"/>
+        </w:rPr>
+        <w:t>На основе базового класса Pokemon написать свои классы для заданных видов покемонов. Каждый вид покемона должен иметь один или два типа и стандартные базовые характеристики:</w:t>
+      </w:r>
+    </w:p>
+    <w:p>
+      <w:pPr>
+        <w:numPr>
+          <w:ilvl w:val="0"/>
+          <w:numId w:val="6"/>
+        </w:numPr>
         <w:rPr>
           <w:rFonts w:ascii="Times New Roman" w:eastAsia="Times New Roman" w:hAnsi="Times New Roman" w:cs="Times New Roman"/>
           <w:kern w:val="0"/>
-          <w:sz w:val="20"/>
-          <w:szCs w:val="20"/>
-          <w:lang w:eastAsia="ru-RU" w:bidi="ar-SA"/>
-        </w:rPr>
-        <w:t>Pokemon</w:t>
-      </w:r>
-      <w:proofErr w:type="spellEnd"/>
+          <w:lang w:val="en-RU" w:eastAsia="ru-RU" w:bidi="ar-SA"/>
+        </w:rPr>
+      </w:pPr>
       <w:r>
         <w:rPr>
           <w:rFonts w:ascii="Times New Roman" w:eastAsia="Times New Roman" w:hAnsi="Times New Roman" w:cs="Times New Roman"/>
           <w:kern w:val="0"/>
-          <w:lang w:eastAsia="ru-RU" w:bidi="ar-SA"/>
-        </w:rPr>
-        <w:t xml:space="preserve"> написать свои классы для заданных видов покемонов. Каждый вид покемона должен иметь один или два типа и стандартные базовые характеристики:</w:t>
+          <w:lang w:val="en-RU" w:eastAsia="ru-RU" w:bidi="ar-SA"/>
+        </w:rPr>
+        <w:t>очки здоровья (HP)</w:t>
       </w:r>
     </w:p>
     <w:p>
       <w:pPr>
         <w:numPr>
           <w:ilvl w:val="0"/>
-          <w:numId w:val="4"/>
+          <w:numId w:val="6"/>
         </w:numPr>
-        <w:suppressAutoHyphens w:val="0"/>
-        <w:autoSpaceDN/>
-        <w:spacing w:before="100" w:beforeAutospacing="1" w:after="100" w:afterAutospacing="1"/>
         <w:rPr>
           <w:rFonts w:ascii="Times New Roman" w:eastAsia="Times New Roman" w:hAnsi="Times New Roman" w:cs="Times New Roman"/>
           <w:kern w:val="0"/>
-          <w:lang w:eastAsia="ru-RU" w:bidi="ar-SA"/>
+          <w:lang w:val="en-RU" w:eastAsia="ru-RU" w:bidi="ar-SA"/>
         </w:rPr>
       </w:pPr>
       <w:r>
         <w:rPr>
           <w:rFonts w:ascii="Times New Roman" w:eastAsia="Times New Roman" w:hAnsi="Times New Roman" w:cs="Times New Roman"/>
           <w:kern w:val="0"/>
-          <w:lang w:eastAsia="ru-RU" w:bidi="ar-SA"/>
-        </w:rPr>
-        <w:t>очки здоровья (HP)</w:t>
+          <w:lang w:val="en-RU" w:eastAsia="ru-RU" w:bidi="ar-SA"/>
+        </w:rPr>
+        <w:t>атака (attack)</w:t>
       </w:r>
     </w:p>
     <w:p>
       <w:pPr>
         <w:numPr>
           <w:ilvl w:val="0"/>
-          <w:numId w:val="4"/>
+          <w:numId w:val="6"/>
         </w:numPr>
-        <w:suppressAutoHyphens w:val="0"/>
-        <w:autoSpaceDN/>
-        <w:spacing w:before="100" w:beforeAutospacing="1" w:after="100" w:afterAutospacing="1"/>
         <w:rPr>
           <w:rFonts w:ascii="Times New Roman" w:eastAsia="Times New Roman" w:hAnsi="Times New Roman" w:cs="Times New Roman"/>
           <w:kern w:val="0"/>
-          <w:lang w:eastAsia="ru-RU" w:bidi="ar-SA"/>
+          <w:lang w:val="en-RU" w:eastAsia="ru-RU" w:bidi="ar-SA"/>
         </w:rPr>
       </w:pPr>
       <w:r>
         <w:rPr>
           <w:rFonts w:ascii="Times New Roman" w:eastAsia="Times New Roman" w:hAnsi="Times New Roman" w:cs="Times New Roman"/>
           <w:kern w:val="0"/>
-          <w:lang w:eastAsia="ru-RU" w:bidi="ar-SA"/>
-        </w:rPr>
-        <w:t>атака (</w:t>
-      </w:r>
-      <w:proofErr w:type="spellStart"/>
-      <w:r>
+          <w:lang w:val="en-RU" w:eastAsia="ru-RU" w:bidi="ar-SA"/>
+        </w:rPr>
+        <w:t>защита (defense)</w:t>
+      </w:r>
+    </w:p>
+    <w:p>
+      <w:pPr>
+        <w:numPr>
+          <w:ilvl w:val="0"/>
+          <w:numId w:val="6"/>
+        </w:numPr>
         <w:rPr>
           <w:rFonts w:ascii="Times New Roman" w:eastAsia="Times New Roman" w:hAnsi="Times New Roman" w:cs="Times New Roman"/>
           <w:kern w:val="0"/>
-          <w:lang w:eastAsia="ru-RU" w:bidi="ar-SA"/>
-        </w:rPr>
-        <w:t>attack</w:t>
-      </w:r>
-      <w:proofErr w:type="spellEnd"/>
+          <w:lang w:val="en-RU" w:eastAsia="ru-RU" w:bidi="ar-SA"/>
+        </w:rPr>
+      </w:pPr>
       <w:r>
         <w:rPr>
           <w:rFonts w:ascii="Times New Roman" w:eastAsia="Times New Roman" w:hAnsi="Times New Roman" w:cs="Times New Roman"/>
           <w:kern w:val="0"/>
-          <w:lang w:eastAsia="ru-RU" w:bidi="ar-SA"/>
-        </w:rPr>
-        <w:t>)</w:t>
+          <w:lang w:val="en-RU" w:eastAsia="ru-RU" w:bidi="ar-SA"/>
+        </w:rPr>
+        <w:t>специальная атака (special attack)</w:t>
       </w:r>
     </w:p>
     <w:p>
       <w:pPr>
         <w:numPr>
           <w:ilvl w:val="0"/>
-          <w:numId w:val="4"/>
+          <w:numId w:val="6"/>
         </w:numPr>
-        <w:suppressAutoHyphens w:val="0"/>
-        <w:autoSpaceDN/>
-        <w:spacing w:before="100" w:beforeAutospacing="1" w:after="100" w:afterAutospacing="1"/>
         <w:rPr>
           <w:rFonts w:ascii="Times New Roman" w:eastAsia="Times New Roman" w:hAnsi="Times New Roman" w:cs="Times New Roman"/>
           <w:kern w:val="0"/>
-          <w:lang w:eastAsia="ru-RU" w:bidi="ar-SA"/>
+          <w:lang w:val="en-RU" w:eastAsia="ru-RU" w:bidi="ar-SA"/>
         </w:rPr>
       </w:pPr>
       <w:r>
         <w:rPr>
           <w:rFonts w:ascii="Times New Roman" w:eastAsia="Times New Roman" w:hAnsi="Times New Roman" w:cs="Times New Roman"/>
           <w:kern w:val="0"/>
-          <w:lang w:eastAsia="ru-RU" w:bidi="ar-SA"/>
-        </w:rPr>
-        <w:t>защита (</w:t>
-      </w:r>
-      <w:proofErr w:type="spellStart"/>
-      <w:r>
+          <w:lang w:val="en-RU" w:eastAsia="ru-RU" w:bidi="ar-SA"/>
+        </w:rPr>
+        <w:t>специальная защита (special defense)</w:t>
+      </w:r>
+    </w:p>
+    <w:p>
+      <w:pPr>
+        <w:numPr>
+          <w:ilvl w:val="0"/>
+          <w:numId w:val="6"/>
+        </w:numPr>
         <w:rPr>
           <w:rFonts w:ascii="Times New Roman" w:eastAsia="Times New Roman" w:hAnsi="Times New Roman" w:cs="Times New Roman"/>
           <w:kern w:val="0"/>
-          <w:lang w:eastAsia="ru-RU" w:bidi="ar-SA"/>
-        </w:rPr>
-        <w:t>defense</w:t>
-      </w:r>
-      <w:proofErr w:type="spellEnd"/>
+          <w:lang w:val="en-RU" w:eastAsia="ru-RU" w:bidi="ar-SA"/>
+        </w:rPr>
+      </w:pPr>
       <w:r>
         <w:rPr>
           <w:rFonts w:ascii="Times New Roman" w:eastAsia="Times New Roman" w:hAnsi="Times New Roman" w:cs="Times New Roman"/>
           <w:kern w:val="0"/>
-          <w:lang w:eastAsia="ru-RU" w:bidi="ar-SA"/>
-        </w:rPr>
-        <w:t>)</w:t>
-      </w:r>
-    </w:p>
-    <w:p>
-      <w:pPr>
-        <w:numPr>
-          <w:ilvl w:val="0"/>
-          <w:numId w:val="4"/>
-        </w:numPr>
-        <w:suppressAutoHyphens w:val="0"/>
-        <w:autoSpaceDN/>
-        <w:spacing w:before="100" w:beforeAutospacing="1" w:after="100" w:afterAutospacing="1"/>
+          <w:lang w:val="en-RU" w:eastAsia="ru-RU" w:bidi="ar-SA"/>
+        </w:rPr>
+        <w:t>скорость (speed)</w:t>
+      </w:r>
+    </w:p>
+    <w:p>
+      <w:pPr>
+        <w:ind w:left="360"/>
         <w:rPr>
           <w:rFonts w:ascii="Times New Roman" w:eastAsia="Times New Roman" w:hAnsi="Times New Roman" w:cs="Times New Roman"/>
           <w:kern w:val="0"/>
-          <w:lang w:eastAsia="ru-RU" w:bidi="ar-SA"/>
-        </w:rPr>
-      </w:pPr>
-      <w:r>
+          <w:lang w:val="en-RU" w:eastAsia="ru-RU" w:bidi="ar-SA"/>
+        </w:rPr>
+      </w:pPr>
+    </w:p>
+    <w:p>
+      <w:pPr>
+        <w:ind w:firstLine="360"/>
         <w:rPr>
           <w:rFonts w:ascii="Times New Roman" w:eastAsia="Times New Roman" w:hAnsi="Times New Roman" w:cs="Times New Roman"/>
           <w:kern w:val="0"/>
-          <w:lang w:eastAsia="ru-RU" w:bidi="ar-SA"/>
-        </w:rPr>
-        <w:t>специальная атака (</w:t>
-      </w:r>
-      <w:proofErr w:type="spellStart"/>
+          <w:lang w:val="en-RU" w:eastAsia="ru-RU" w:bidi="ar-SA"/>
+        </w:rPr>
+      </w:pPr>
       <w:r>
         <w:rPr>
           <w:rFonts w:ascii="Times New Roman" w:eastAsia="Times New Roman" w:hAnsi="Times New Roman" w:cs="Times New Roman"/>
           <w:kern w:val="0"/>
-          <w:lang w:eastAsia="ru-RU" w:bidi="ar-SA"/>
-        </w:rPr>
-        <w:t>special</w:t>
-      </w:r>
-      <w:proofErr w:type="spellEnd"/>
-      <w:r>
+          <w:lang w:val="en-RU" w:eastAsia="ru-RU" w:bidi="ar-SA"/>
+        </w:rPr>
+        <w:t>Классы покемонов должны наследоваться в соответствии с цепочкой эволюции покемонов. На основе базовых классов PhysicalMove, SpecialMove и StatusMove реализовать свои классы для заданных видов атак.</w:t>
+      </w:r>
+    </w:p>
+    <w:p>
+      <w:pPr>
         <w:rPr>
           <w:rFonts w:ascii="Times New Roman" w:eastAsia="Times New Roman" w:hAnsi="Times New Roman" w:cs="Times New Roman"/>
           <w:kern w:val="0"/>
-          <w:lang w:eastAsia="ru-RU" w:bidi="ar-SA"/>
-        </w:rPr>
-        <w:t xml:space="preserve"> </w:t>
-      </w:r>
-      <w:proofErr w:type="spellStart"/>
-      <w:r>
+          <w:lang w:val="en-RU" w:eastAsia="ru-RU" w:bidi="ar-SA"/>
+        </w:rPr>
+      </w:pPr>
+    </w:p>
+    <w:p>
+      <w:pPr>
+        <w:ind w:firstLine="360"/>
         <w:rPr>
           <w:rFonts w:ascii="Times New Roman" w:eastAsia="Times New Roman" w:hAnsi="Times New Roman" w:cs="Times New Roman"/>
           <w:kern w:val="0"/>
-          <w:lang w:eastAsia="ru-RU" w:bidi="ar-SA"/>
-        </w:rPr>
-        <w:t>attack</w:t>
-      </w:r>
-      <w:proofErr w:type="spellEnd"/>
+          <w:lang w:val="en-RU" w:eastAsia="ru-RU" w:bidi="ar-SA"/>
+        </w:rPr>
+      </w:pPr>
       <w:r>
         <w:rPr>
           <w:rFonts w:ascii="Times New Roman" w:eastAsia="Times New Roman" w:hAnsi="Times New Roman" w:cs="Times New Roman"/>
           <w:kern w:val="0"/>
-          <w:lang w:eastAsia="ru-RU" w:bidi="ar-SA"/>
-        </w:rPr>
-        <w:t>)</w:t>
-      </w:r>
-    </w:p>
-    <w:p>
-      <w:pPr>
-        <w:numPr>
-          <w:ilvl w:val="0"/>
-          <w:numId w:val="4"/>
-        </w:numPr>
-        <w:suppressAutoHyphens w:val="0"/>
-        <w:autoSpaceDN/>
-        <w:spacing w:before="100" w:beforeAutospacing="1" w:after="100" w:afterAutospacing="1"/>
+          <w:lang w:val="en-RU" w:eastAsia="ru-RU" w:bidi="ar-SA"/>
+        </w:rPr>
+        <w:t>Атака должна иметь стандартные тип, силу (power) и точность (accuracy). Должны быть реализованы стандартные эффекты атаки. Назначить каждому виду покемонов атаки в соответствии с вариантом. Уровень покемона выбирается минимально необходимым для всех реализованных атак.</w:t>
+      </w:r>
+    </w:p>
+    <w:p>
+      <w:pPr>
         <w:rPr>
           <w:rFonts w:ascii="Times New Roman" w:eastAsia="Times New Roman" w:hAnsi="Times New Roman" w:cs="Times New Roman"/>
           <w:kern w:val="0"/>
-          <w:lang w:eastAsia="ru-RU" w:bidi="ar-SA"/>
-        </w:rPr>
-      </w:pPr>
-      <w:r>
+          <w:lang w:val="en-RU" w:eastAsia="ru-RU" w:bidi="ar-SA"/>
+        </w:rPr>
+      </w:pPr>
+    </w:p>
+    <w:p>
+      <w:pPr>
+        <w:ind w:firstLine="360"/>
         <w:rPr>
           <w:rFonts w:ascii="Times New Roman" w:eastAsia="Times New Roman" w:hAnsi="Times New Roman" w:cs="Times New Roman"/>
           <w:kern w:val="0"/>
-          <w:lang w:eastAsia="ru-RU" w:bidi="ar-SA"/>
-        </w:rPr>
-        <w:t>специальная защита (</w:t>
-      </w:r>
-      <w:proofErr w:type="spellStart"/>
+          <w:lang w:val="en-RU" w:eastAsia="ru-RU" w:bidi="ar-SA"/>
+        </w:rPr>
+      </w:pPr>
       <w:r>
         <w:rPr>
           <w:rFonts w:ascii="Times New Roman" w:eastAsia="Times New Roman" w:hAnsi="Times New Roman" w:cs="Times New Roman"/>
           <w:kern w:val="0"/>
-          <w:lang w:eastAsia="ru-RU" w:bidi="ar-SA"/>
-        </w:rPr>
-        <w:t>special</w:t>
-      </w:r>
-      <w:proofErr w:type="spellEnd"/>
-      <w:r>
-        <w:rPr>
-          <w:rFonts w:ascii="Times New Roman" w:eastAsia="Times New Roman" w:hAnsi="Times New Roman" w:cs="Times New Roman"/>
-          <w:kern w:val="0"/>
-          <w:lang w:eastAsia="ru-RU" w:bidi="ar-SA"/>
-        </w:rPr>
-        <w:t xml:space="preserve"> </w:t>
-      </w:r>
-      <w:proofErr w:type="spellStart"/>
-      <w:r>
-        <w:rPr>
-          <w:rFonts w:ascii="Times New Roman" w:eastAsia="Times New Roman" w:hAnsi="Times New Roman" w:cs="Times New Roman"/>
-          <w:kern w:val="0"/>
-          <w:lang w:eastAsia="ru-RU" w:bidi="ar-SA"/>
-        </w:rPr>
-        <w:t>defense</w:t>
-      </w:r>
-      <w:proofErr w:type="spellEnd"/>
-      <w:r>
-        <w:rPr>
-          <w:rFonts w:ascii="Times New Roman" w:eastAsia="Times New Roman" w:hAnsi="Times New Roman" w:cs="Times New Roman"/>
-          <w:kern w:val="0"/>
-          <w:lang w:eastAsia="ru-RU" w:bidi="ar-SA"/>
-        </w:rPr>
-        <w:t>)</w:t>
-      </w:r>
-    </w:p>
-    <w:p>
-      <w:pPr>
-        <w:numPr>
-          <w:ilvl w:val="0"/>
-          <w:numId w:val="4"/>
-        </w:numPr>
-        <w:suppressAutoHyphens w:val="0"/>
-        <w:autoSpaceDN/>
-        <w:spacing w:before="100" w:beforeAutospacing="1" w:after="100" w:afterAutospacing="1"/>
-        <w:rPr>
-          <w:rFonts w:ascii="Times New Roman" w:eastAsia="Times New Roman" w:hAnsi="Times New Roman" w:cs="Times New Roman"/>
-          <w:kern w:val="0"/>
-          <w:lang w:eastAsia="ru-RU" w:bidi="ar-SA"/>
-        </w:rPr>
-      </w:pPr>
-      <w:r>
-        <w:rPr>
-          <w:rFonts w:ascii="Times New Roman" w:eastAsia="Times New Roman" w:hAnsi="Times New Roman" w:cs="Times New Roman"/>
-          <w:kern w:val="0"/>
-          <w:lang w:eastAsia="ru-RU" w:bidi="ar-SA"/>
-        </w:rPr>
-        <w:t>скорость (</w:t>
-      </w:r>
-      <w:proofErr w:type="spellStart"/>
-      <w:r>
-        <w:rPr>
-          <w:rFonts w:ascii="Times New Roman" w:eastAsia="Times New Roman" w:hAnsi="Times New Roman" w:cs="Times New Roman"/>
-          <w:kern w:val="0"/>
-          <w:lang w:eastAsia="ru-RU" w:bidi="ar-SA"/>
-        </w:rPr>
-        <w:t>speed</w:t>
-      </w:r>
-      <w:proofErr w:type="spellEnd"/>
-      <w:r>
-        <w:rPr>
-          <w:rFonts w:ascii="Times New Roman" w:eastAsia="Times New Roman" w:hAnsi="Times New Roman" w:cs="Times New Roman"/>
-          <w:kern w:val="0"/>
-          <w:lang w:eastAsia="ru-RU" w:bidi="ar-SA"/>
-        </w:rPr>
-        <w:t>)</w:t>
-      </w:r>
-    </w:p>
-    <w:p>
-      <w:pPr>
-        <w:suppressAutoHyphens w:val="0"/>
-        <w:autoSpaceDN/>
-        <w:spacing w:before="100" w:beforeAutospacing="1" w:after="100" w:afterAutospacing="1"/>
-        <w:rPr>
-          <w:rFonts w:ascii="Times New Roman" w:eastAsia="Times New Roman" w:hAnsi="Times New Roman" w:cs="Times New Roman"/>
-          <w:kern w:val="0"/>
-          <w:lang w:eastAsia="ru-RU" w:bidi="ar-SA"/>
-        </w:rPr>
-      </w:pPr>
-      <w:r>
-        <w:rPr>
-          <w:rFonts w:ascii="Times New Roman" w:eastAsia="Times New Roman" w:hAnsi="Times New Roman" w:cs="Times New Roman"/>
-          <w:kern w:val="0"/>
-          <w:lang w:eastAsia="ru-RU" w:bidi="ar-SA"/>
-        </w:rPr>
-        <w:t xml:space="preserve">Классы покемонов должны наследоваться в соответствии с цепочкой эволюции покемонов. На основе базовых классов </w:t>
-      </w:r>
-      <w:proofErr w:type="spellStart"/>
-      <w:r>
-        <w:rPr>
-          <w:rFonts w:ascii="Times New Roman" w:eastAsia="Times New Roman" w:hAnsi="Times New Roman" w:cs="Times New Roman"/>
-          <w:kern w:val="0"/>
-          <w:sz w:val="20"/>
-          <w:szCs w:val="20"/>
-          <w:lang w:eastAsia="ru-RU" w:bidi="ar-SA"/>
-        </w:rPr>
-        <w:t>PhysicalMove</w:t>
-      </w:r>
-      <w:proofErr w:type="spellEnd"/>
-      <w:r>
-        <w:rPr>
-          <w:rFonts w:ascii="Times New Roman" w:eastAsia="Times New Roman" w:hAnsi="Times New Roman" w:cs="Times New Roman"/>
-          <w:kern w:val="0"/>
-          <w:lang w:eastAsia="ru-RU" w:bidi="ar-SA"/>
-        </w:rPr>
-        <w:t xml:space="preserve">, </w:t>
-      </w:r>
-      <w:proofErr w:type="spellStart"/>
-      <w:r>
-        <w:rPr>
-          <w:rFonts w:ascii="Times New Roman" w:eastAsia="Times New Roman" w:hAnsi="Times New Roman" w:cs="Times New Roman"/>
-          <w:kern w:val="0"/>
-          <w:sz w:val="20"/>
-          <w:szCs w:val="20"/>
-          <w:lang w:eastAsia="ru-RU" w:bidi="ar-SA"/>
-        </w:rPr>
-        <w:t>SpecialMove</w:t>
-      </w:r>
-      <w:proofErr w:type="spellEnd"/>
-      <w:r>
-        <w:rPr>
-          <w:rFonts w:ascii="Times New Roman" w:eastAsia="Times New Roman" w:hAnsi="Times New Roman" w:cs="Times New Roman"/>
-          <w:kern w:val="0"/>
-          <w:lang w:eastAsia="ru-RU" w:bidi="ar-SA"/>
-        </w:rPr>
-        <w:t xml:space="preserve"> и </w:t>
-      </w:r>
-      <w:proofErr w:type="spellStart"/>
-      <w:r>
-        <w:rPr>
-          <w:rFonts w:ascii="Times New Roman" w:eastAsia="Times New Roman" w:hAnsi="Times New Roman" w:cs="Times New Roman"/>
-          <w:kern w:val="0"/>
-          <w:sz w:val="20"/>
-          <w:szCs w:val="20"/>
-          <w:lang w:eastAsia="ru-RU" w:bidi="ar-SA"/>
-        </w:rPr>
-        <w:t>StatusMove</w:t>
-      </w:r>
-      <w:proofErr w:type="spellEnd"/>
-      <w:r>
-        <w:rPr>
-          <w:rFonts w:ascii="Times New Roman" w:eastAsia="Times New Roman" w:hAnsi="Times New Roman" w:cs="Times New Roman"/>
-          <w:kern w:val="0"/>
-          <w:lang w:eastAsia="ru-RU" w:bidi="ar-SA"/>
-        </w:rPr>
-        <w:t xml:space="preserve"> реализовать свои классы для заданных видов атак.</w:t>
-      </w:r>
-    </w:p>
-    <w:p>
-      <w:pPr>
-        <w:suppressAutoHyphens w:val="0"/>
-        <w:autoSpaceDN/>
-        <w:spacing w:before="100" w:beforeAutospacing="1" w:after="100" w:afterAutospacing="1"/>
-        <w:rPr>
-          <w:rFonts w:ascii="Times New Roman" w:eastAsia="Times New Roman" w:hAnsi="Times New Roman" w:cs="Times New Roman"/>
-          <w:kern w:val="0"/>
-          <w:lang w:eastAsia="ru-RU" w:bidi="ar-SA"/>
-        </w:rPr>
-      </w:pPr>
-      <w:r>
-        <w:rPr>
-          <w:rFonts w:ascii="Times New Roman" w:eastAsia="Times New Roman" w:hAnsi="Times New Roman" w:cs="Times New Roman"/>
-          <w:kern w:val="0"/>
-          <w:lang w:eastAsia="ru-RU" w:bidi="ar-SA"/>
-        </w:rPr>
-        <w:t>Атака должна иметь стандартные тип, силу (</w:t>
-      </w:r>
-      <w:proofErr w:type="spellStart"/>
-      <w:r>
-        <w:rPr>
-          <w:rFonts w:ascii="Times New Roman" w:eastAsia="Times New Roman" w:hAnsi="Times New Roman" w:cs="Times New Roman"/>
-          <w:kern w:val="0"/>
-          <w:lang w:eastAsia="ru-RU" w:bidi="ar-SA"/>
-        </w:rPr>
-        <w:t>power</w:t>
-      </w:r>
-      <w:proofErr w:type="spellEnd"/>
-      <w:r>
-        <w:rPr>
-          <w:rFonts w:ascii="Times New Roman" w:eastAsia="Times New Roman" w:hAnsi="Times New Roman" w:cs="Times New Roman"/>
-          <w:kern w:val="0"/>
-          <w:lang w:eastAsia="ru-RU" w:bidi="ar-SA"/>
-        </w:rPr>
-        <w:t>) и точность (</w:t>
-      </w:r>
-      <w:proofErr w:type="spellStart"/>
-      <w:r>
-        <w:rPr>
-          <w:rFonts w:ascii="Times New Roman" w:eastAsia="Times New Roman" w:hAnsi="Times New Roman" w:cs="Times New Roman"/>
-          <w:kern w:val="0"/>
-          <w:lang w:eastAsia="ru-RU" w:bidi="ar-SA"/>
-        </w:rPr>
-        <w:t>accuracy</w:t>
-      </w:r>
-      <w:proofErr w:type="spellEnd"/>
-      <w:r>
-        <w:rPr>
-          <w:rFonts w:ascii="Times New Roman" w:eastAsia="Times New Roman" w:hAnsi="Times New Roman" w:cs="Times New Roman"/>
-          <w:kern w:val="0"/>
-          <w:lang w:eastAsia="ru-RU" w:bidi="ar-SA"/>
-        </w:rPr>
-        <w:t>). Должны быть реализованы стандартные эффекты атаки. Назначить каждому виду покемонов атаки в соответствии с вариантом. Уровень покемона выбирается минимально необходимым для всех реализованных атак.</w:t>
-      </w:r>
-    </w:p>
-    <w:p>
-      <w:pPr>
-        <w:suppressAutoHyphens w:val="0"/>
-        <w:autoSpaceDN/>
-        <w:spacing w:before="100" w:beforeAutospacing="1" w:after="100" w:afterAutospacing="1"/>
-        <w:rPr>
-          <w:rFonts w:ascii="Times New Roman" w:eastAsia="Times New Roman" w:hAnsi="Times New Roman" w:cs="Times New Roman"/>
-          <w:kern w:val="0"/>
-          <w:lang w:eastAsia="ru-RU" w:bidi="ar-SA"/>
-        </w:rPr>
-      </w:pPr>
-      <w:r>
-        <w:rPr>
-          <w:rFonts w:ascii="Times New Roman" w:eastAsia="Times New Roman" w:hAnsi="Times New Roman" w:cs="Times New Roman"/>
-          <w:kern w:val="0"/>
-          <w:lang w:eastAsia="ru-RU" w:bidi="ar-SA"/>
-        </w:rPr>
-        <w:t xml:space="preserve">Используя класс симуляции боя </w:t>
-      </w:r>
-      <w:proofErr w:type="spellStart"/>
-      <w:r>
-        <w:rPr>
-          <w:rFonts w:ascii="Times New Roman" w:eastAsia="Times New Roman" w:hAnsi="Times New Roman" w:cs="Times New Roman"/>
-          <w:kern w:val="0"/>
-          <w:sz w:val="20"/>
-          <w:szCs w:val="20"/>
-          <w:lang w:eastAsia="ru-RU" w:bidi="ar-SA"/>
-        </w:rPr>
-        <w:t>Battle</w:t>
-      </w:r>
-      <w:proofErr w:type="spellEnd"/>
-      <w:r>
-        <w:rPr>
-          <w:rFonts w:ascii="Times New Roman" w:eastAsia="Times New Roman" w:hAnsi="Times New Roman" w:cs="Times New Roman"/>
-          <w:kern w:val="0"/>
-          <w:lang w:eastAsia="ru-RU" w:bidi="ar-SA"/>
-        </w:rPr>
-        <w:t>, создать 2 команды покемонов (каждый покемон должен иметь имя) и запустить бой.</w:t>
-      </w:r>
+          <w:lang w:val="en-RU" w:eastAsia="ru-RU" w:bidi="ar-SA"/>
+        </w:rPr>
+        <w:t>Используя класс симуляции боя Battle, создать 2 команды покемонов (каждый покемон должен иметь имя) и запустить бой.</w:t>
+      </w:r>
+    </w:p>
+    <w:p>
+      <w:pPr>
+        <w:rPr>
+          <w:rFonts w:ascii="Times New Roman" w:hAnsi="Times New Roman" w:cs="Times New Roman"/>
+          <w:lang w:val="en-RU"/>
+        </w:rPr>
+      </w:pPr>
     </w:p>
     <w:p>
       <w:pPr>
@@ -1814,14 +1574,13 @@
       </w:pPr>
       <w:r>
         <w:rPr>
-          <w:noProof/>
           <w:lang w:val="en-US"/>
         </w:rPr>
         <w:drawing>
-          <wp:inline distT="0" distB="0" distL="0" distR="0" wp14:anchorId="0C702D84" wp14:editId="076B4912">
-            <wp:extent cx="6026740" cy="1670957"/>
-            <wp:effectExtent l="0" t="0" r="0" b="5715"/>
-            <wp:docPr id="1" name="Рисунок 1"/>
+          <wp:inline distT="0" distB="0" distL="0" distR="0" wp14:anchorId="03F8CABE" wp14:editId="49E0B4A7">
+            <wp:extent cx="5760085" cy="1722120"/>
+            <wp:effectExtent l="0" t="0" r="5715" b="5080"/>
+            <wp:docPr id="1580226202" name="Picture 1"/>
             <wp:cNvGraphicFramePr>
               <a:graphicFrameLocks xmlns:a="http://schemas.openxmlformats.org/drawingml/2006/main" noChangeAspect="1"/>
             </wp:cNvGraphicFramePr>
@@ -1829,7 +1588,7 @@
               <a:graphicData uri="http://schemas.openxmlformats.org/drawingml/2006/picture">
                 <pic:pic xmlns:pic="http://schemas.openxmlformats.org/drawingml/2006/picture">
                   <pic:nvPicPr>
-                    <pic:cNvPr id="1" name=""/>
+                    <pic:cNvPr id="1580226202" name=""/>
                     <pic:cNvPicPr/>
                   </pic:nvPicPr>
                   <pic:blipFill>
@@ -1841,7 +1600,7 @@
                   <pic:spPr>
                     <a:xfrm>
                       <a:off x="0" y="0"/>
-                      <a:ext cx="6063726" cy="1681212"/>
+                      <a:ext cx="5760085" cy="1722120"/>
                     </a:xfrm>
                     <a:prstGeom prst="rect">
                       <a:avLst/>
@@ -1931,7 +1690,7 @@
           <w:noProof/>
         </w:rPr>
         <w:drawing>
-          <wp:inline distT="0" distB="0" distL="0" distR="0" wp14:anchorId="6C1EFB5F" wp14:editId="730952D0">
+          <wp:inline distT="0" distB="0" distL="0" distR="0" wp14:anchorId="6C1EFB5F" wp14:editId="6230D5BF">
             <wp:extent cx="5760085" cy="1872615"/>
             <wp:effectExtent l="0" t="0" r="5715" b="0"/>
             <wp:docPr id="594005283" name="Picture 1"/>
@@ -1975,70 +1734,6 @@
     </w:p>
     <w:p>
       <w:pPr>
-        <w:pStyle w:val="Caption"/>
-        <w:rPr>
-          <w:rFonts w:ascii="Times New Roman" w:hAnsi="Times New Roman"/>
-          <w:lang w:val="en-US"/>
-        </w:rPr>
-      </w:pPr>
-      <w:r>
-        <w:rPr>
-          <w:rFonts w:hint="eastAsia"/>
-        </w:rPr>
-        <w:t>Рисунок</w:t>
-      </w:r>
-      <w:r>
-        <w:rPr>
-          <w:rFonts w:hint="eastAsia"/>
-        </w:rPr>
-        <w:t xml:space="preserve"> </w:t>
-      </w:r>
-      <w:r>
-        <w:rPr>
-          <w:rFonts w:hint="eastAsia"/>
-        </w:rPr>
-        <w:fldChar w:fldCharType="begin"/>
-      </w:r>
-      <w:r>
-        <w:rPr>
-          <w:rFonts w:hint="eastAsia"/>
-        </w:rPr>
-        <w:instrText xml:space="preserve"> SEQ </w:instrText>
-      </w:r>
-      <w:r>
-        <w:rPr>
-          <w:rFonts w:hint="eastAsia"/>
-        </w:rPr>
-        <w:instrText>Рисунок</w:instrText>
-      </w:r>
-      <w:r>
-        <w:rPr>
-          <w:rFonts w:hint="eastAsia"/>
-        </w:rPr>
-        <w:instrText xml:space="preserve"> \* ARABIC </w:instrText>
-      </w:r>
-      <w:r>
-        <w:rPr>
-          <w:rFonts w:hint="eastAsia"/>
-        </w:rPr>
-        <w:fldChar w:fldCharType="separate"/>
-      </w:r>
-      <w:r>
-        <w:rPr>
-          <w:rFonts w:hint="eastAsia"/>
-          <w:noProof/>
-        </w:rPr>
-        <w:t>1</w:t>
-      </w:r>
-      <w:r>
-        <w:rPr>
-          <w:rFonts w:hint="eastAsia"/>
-        </w:rPr>
-        <w:fldChar w:fldCharType="end"/>
-      </w:r>
-    </w:p>
-    <w:p>
-      <w:pPr>
         <w:pStyle w:val="Heading1"/>
         <w:pageBreakBefore/>
         <w:rPr>
@@ -2057,13 +1752,42 @@
     </w:p>
     <w:p>
       <w:r>
-        <w:t xml:space="preserve">Ссылка на </w:t>
-      </w:r>
-      <w:proofErr w:type="spellStart"/>
-      <w:r>
-        <w:t>гитхаб</w:t>
-      </w:r>
-      <w:proofErr w:type="spellEnd"/>
+        <w:fldChar w:fldCharType="begin"/>
+      </w:r>
+      <w:r>
+        <w:instrText>HYPERLINK "</w:instrText>
+      </w:r>
+      <w:r>
+        <w:instrText>https://github.com/vanya9090/itmo/tree/main/programming/lab_2/sr</w:instrText>
+      </w:r>
+      <w:r>
+        <w:rPr>
+          <w:lang w:val="en-US"/>
+        </w:rPr>
+        <w:instrText>c</w:instrText>
+      </w:r>
+      <w:r>
+        <w:instrText>"</w:instrText>
+      </w:r>
+      <w:r>
+        <w:fldChar w:fldCharType="separate"/>
+      </w:r>
+      <w:r>
+        <w:rPr>
+          <w:rStyle w:val="Hyperlink"/>
+        </w:rPr>
+        <w:t>https://github.com/vanya9090/itmo/tree/main/programming/lab_2/sr</w:t>
+      </w:r>
+      <w:r>
+        <w:rPr>
+          <w:rStyle w:val="Hyperlink"/>
+          <w:lang w:val="en-US"/>
+        </w:rPr>
+        <w:t>c</w:t>
+      </w:r>
+      <w:r>
+        <w:fldChar w:fldCharType="end"/>
+      </w:r>
     </w:p>
     <w:p>
       <w:pPr>
@@ -2078,7 +1802,31 @@
           <w:rFonts w:cs="Times New Roman"/>
         </w:rPr>
         <w:lastRenderedPageBreak/>
-        <w:t>Результат работы программы</w:t>
+        <w:t>Результат</w:t>
+      </w:r>
+      <w:r>
+        <w:rPr>
+          <w:rFonts w:cs="Times New Roman"/>
+        </w:rPr>
+        <w:t xml:space="preserve"> </w:t>
+      </w:r>
+      <w:r>
+        <w:rPr>
+          <w:rFonts w:cs="Times New Roman"/>
+        </w:rPr>
+        <w:t>работы</w:t>
+      </w:r>
+      <w:r>
+        <w:rPr>
+          <w:rFonts w:cs="Times New Roman"/>
+        </w:rPr>
+        <w:t xml:space="preserve"> </w:t>
+      </w:r>
+      <w:r>
+        <w:rPr>
+          <w:rFonts w:cs="Times New Roman"/>
+        </w:rPr>
+        <w:t>программы</w:t>
       </w:r>
       <w:r>
         <w:rPr>
@@ -3669,6 +3417,7 @@
         <w:rPr>
           <w:rFonts w:cs="Times New Roman"/>
           <w:u w:val="single"/>
+          <w:lang w:val="en-US"/>
         </w:rPr>
       </w:pPr>
       <w:r>
@@ -3731,8 +3480,11 @@
           <w:numId w:val="5"/>
         </w:numPr>
         <w:rPr>
-          <w:rFonts w:ascii="Times New Roman" w:hAnsi="Times New Roman" w:cs="Times New Roman"/>
+          <w:rStyle w:val="Hyperlink"/>
+          <w:rFonts w:ascii="Times New Roman" w:hAnsi="Times New Roman" w:cs="Times New Roman"/>
+          <w:color w:val="auto"/>
           <w:sz w:val="28"/>
+          <w:u w:val="none"/>
           <w:lang w:eastAsia="ru-RU" w:bidi="ar-SA"/>
         </w:rPr>
       </w:pPr>
@@ -3760,445 +3512,31 @@
     </w:p>
     <w:p>
       <w:pPr>
-        <w:pStyle w:val="ListParagraph"/>
+        <w:pStyle w:val="Heading2"/>
         <w:numPr>
           <w:ilvl w:val="0"/>
           <w:numId w:val="5"/>
         </w:numPr>
-        <w:rPr>
-          <w:rFonts w:ascii="Times New Roman" w:hAnsi="Times New Roman" w:cs="Times New Roman"/>
-          <w:sz w:val="28"/>
-          <w:lang w:eastAsia="ru-RU" w:bidi="ar-SA"/>
-        </w:rPr>
-      </w:pPr>
-      <w:hyperlink r:id="rId9" w:history="1">
-        <w:r>
-          <w:rPr>
-            <w:rStyle w:val="Hyperlink"/>
-            <w:rFonts w:ascii="Times New Roman" w:hAnsi="Times New Roman" w:cs="Times New Roman" w:hint="eastAsia"/>
-            <w:sz w:val="28"/>
-            <w:lang w:eastAsia="ru-RU" w:bidi="ar-SA"/>
-          </w:rPr>
-          <w:t>https://javarush.ru/groups/posts/1981-dlja-chego-v-java-nuzhnih-interfeysih</w:t>
-        </w:r>
-      </w:hyperlink>
-    </w:p>
-    <w:p>
-      <w:pPr>
-        <w:pStyle w:val="ListParagraph"/>
-        <w:rPr>
-          <w:rFonts w:ascii="Times New Roman" w:hAnsi="Times New Roman" w:cs="Times New Roman"/>
-          <w:sz w:val="28"/>
-          <w:lang w:eastAsia="ru-RU" w:bidi="ar-SA"/>
-        </w:rPr>
-      </w:pPr>
-    </w:p>
-    <w:p>
-      <w:pPr>
-        <w:pStyle w:val="ListParagraph"/>
-        <w:numPr>
-          <w:ilvl w:val="0"/>
-          <w:numId w:val="5"/>
-        </w:numPr>
-        <w:rPr>
-          <w:rFonts w:ascii="Times New Roman" w:hAnsi="Times New Roman" w:cs="Times New Roman"/>
-          <w:sz w:val="28"/>
-          <w:lang w:eastAsia="ru-RU" w:bidi="ar-SA"/>
-        </w:rPr>
-      </w:pPr>
-      <w:hyperlink r:id="rId10" w:history="1">
-        <w:r>
-          <w:rPr>
-            <w:rStyle w:val="Hyperlink"/>
-            <w:rFonts w:ascii="Times New Roman" w:hAnsi="Times New Roman" w:cs="Times New Roman" w:hint="eastAsia"/>
-            <w:sz w:val="28"/>
-            <w:lang w:eastAsia="ru-RU" w:bidi="ar-SA"/>
-          </w:rPr>
-          <w:t>https://javarush.ru/groups/posts/591-vot-tak-final</w:t>
-        </w:r>
-      </w:hyperlink>
-    </w:p>
-    <w:p>
-      <w:pPr>
-        <w:pStyle w:val="ListParagraph"/>
-        <w:rPr>
-          <w:rFonts w:ascii="Times New Roman" w:hAnsi="Times New Roman" w:cs="Times New Roman"/>
-          <w:sz w:val="28"/>
-          <w:lang w:eastAsia="ru-RU" w:bidi="ar-SA"/>
-        </w:rPr>
-      </w:pPr>
-    </w:p>
-    <w:p>
-      <w:pPr>
-        <w:pStyle w:val="ListParagraph"/>
-        <w:numPr>
-          <w:ilvl w:val="0"/>
-          <w:numId w:val="5"/>
-        </w:numPr>
-        <w:rPr>
-          <w:rFonts w:ascii="Times New Roman" w:hAnsi="Times New Roman" w:cs="Times New Roman"/>
-          <w:sz w:val="28"/>
-          <w:lang w:eastAsia="ru-RU" w:bidi="ar-SA"/>
-        </w:rPr>
-      </w:pPr>
-      <w:hyperlink r:id="rId11" w:history="1">
-        <w:r>
-          <w:rPr>
-            <w:rStyle w:val="Hyperlink"/>
-            <w:rFonts w:ascii="Times New Roman" w:hAnsi="Times New Roman" w:cs="Times New Roman" w:hint="eastAsia"/>
-            <w:sz w:val="28"/>
-            <w:lang w:eastAsia="ru-RU" w:bidi="ar-SA"/>
-          </w:rPr>
-          <w:t>https://www.youtube.com/watch?v=3Xo6zSBgdgk</w:t>
-        </w:r>
-      </w:hyperlink>
-    </w:p>
-    <w:p>
-      <w:pPr>
-        <w:pStyle w:val="ListParagraph"/>
-        <w:rPr>
-          <w:rFonts w:ascii="Times New Roman" w:hAnsi="Times New Roman" w:cs="Times New Roman"/>
-          <w:sz w:val="28"/>
-          <w:lang w:eastAsia="ru-RU" w:bidi="ar-SA"/>
-        </w:rPr>
-      </w:pPr>
-    </w:p>
-    <w:p>
-      <w:pPr>
-        <w:pStyle w:val="ListParagraph"/>
-        <w:numPr>
-          <w:ilvl w:val="0"/>
-          <w:numId w:val="5"/>
-        </w:numPr>
-        <w:rPr>
-          <w:rFonts w:ascii="Times New Roman" w:hAnsi="Times New Roman" w:cs="Times New Roman"/>
-          <w:sz w:val="28"/>
-          <w:lang w:eastAsia="ru-RU" w:bidi="ar-SA"/>
-        </w:rPr>
-      </w:pPr>
-      <w:hyperlink r:id="rId12" w:history="1">
-        <w:r>
-          <w:rPr>
-            <w:rStyle w:val="Hyperlink"/>
-            <w:rFonts w:ascii="Times New Roman" w:hAnsi="Times New Roman" w:cs="Times New Roman" w:hint="eastAsia"/>
-            <w:sz w:val="28"/>
-            <w:lang w:eastAsia="ru-RU" w:bidi="ar-SA"/>
-          </w:rPr>
-          <w:t>https://javarush.ru/groups/posts/1985-raznica-mezhdu-abstraktnihmi-klassami-i-interfeysami</w:t>
-        </w:r>
-      </w:hyperlink>
-    </w:p>
-    <w:p>
-      <w:pPr>
-        <w:pStyle w:val="ListParagraph"/>
-        <w:rPr>
-          <w:rFonts w:ascii="Times New Roman" w:hAnsi="Times New Roman" w:cs="Times New Roman"/>
-          <w:sz w:val="28"/>
-          <w:lang w:eastAsia="ru-RU" w:bidi="ar-SA"/>
-        </w:rPr>
-      </w:pPr>
-    </w:p>
-    <w:p>
-      <w:pPr>
-        <w:pStyle w:val="ListParagraph"/>
-        <w:numPr>
-          <w:ilvl w:val="0"/>
-          <w:numId w:val="5"/>
-        </w:numPr>
-        <w:rPr>
-          <w:rFonts w:ascii="Times New Roman" w:hAnsi="Times New Roman" w:cs="Times New Roman"/>
-          <w:sz w:val="28"/>
-          <w:lang w:eastAsia="ru-RU" w:bidi="ar-SA"/>
-        </w:rPr>
-      </w:pPr>
-      <w:hyperlink r:id="rId13" w:history="1">
-        <w:r>
-          <w:rPr>
-            <w:rStyle w:val="Hyperlink"/>
-            <w:rFonts w:ascii="Times New Roman" w:hAnsi="Times New Roman" w:cs="Times New Roman" w:hint="eastAsia"/>
-            <w:sz w:val="28"/>
-            <w:lang w:eastAsia="ru-RU" w:bidi="ar-SA"/>
-          </w:rPr>
-          <w:t>https://skillbox.ru/media/base/klassy-i-obekty-v-java/</w:t>
-        </w:r>
-      </w:hyperlink>
-    </w:p>
-    <w:p>
-      <w:pPr>
-        <w:pStyle w:val="ListParagraph"/>
-        <w:rPr>
-          <w:rFonts w:ascii="Times New Roman" w:hAnsi="Times New Roman" w:cs="Times New Roman"/>
-          <w:sz w:val="28"/>
-          <w:lang w:eastAsia="ru-RU" w:bidi="ar-SA"/>
-        </w:rPr>
-      </w:pPr>
-    </w:p>
-    <w:p>
-      <w:pPr>
-        <w:pStyle w:val="ListParagraph"/>
-        <w:numPr>
-          <w:ilvl w:val="0"/>
-          <w:numId w:val="5"/>
-        </w:numPr>
-        <w:rPr>
-          <w:rFonts w:ascii="Times New Roman" w:hAnsi="Times New Roman" w:cs="Times New Roman"/>
-          <w:sz w:val="28"/>
-          <w:lang w:eastAsia="ru-RU" w:bidi="ar-SA"/>
-        </w:rPr>
-      </w:pPr>
-      <w:hyperlink r:id="rId14" w:anchor="analyze_graph" w:history="1">
-        <w:r>
-          <w:rPr>
-            <w:rStyle w:val="Hyperlink"/>
-            <w:rFonts w:ascii="Times New Roman" w:hAnsi="Times New Roman" w:cs="Times New Roman" w:hint="eastAsia"/>
-            <w:sz w:val="28"/>
-            <w:lang w:eastAsia="ru-RU" w:bidi="ar-SA"/>
-          </w:rPr>
-          <w:t>https://www.jetbrains.com/help/idea/class-diagram.html#analyze_graph</w:t>
-        </w:r>
-      </w:hyperlink>
-    </w:p>
-    <w:p>
-      <w:pPr>
-        <w:pStyle w:val="ListParagraph"/>
-        <w:rPr>
-          <w:rFonts w:ascii="Times New Roman" w:hAnsi="Times New Roman" w:cs="Times New Roman"/>
-          <w:sz w:val="28"/>
-          <w:lang w:eastAsia="ru-RU" w:bidi="ar-SA"/>
-        </w:rPr>
-      </w:pPr>
-    </w:p>
-    <w:p>
-      <w:pPr>
-        <w:pStyle w:val="ListParagraph"/>
-        <w:numPr>
-          <w:ilvl w:val="0"/>
-          <w:numId w:val="5"/>
-        </w:numPr>
-        <w:rPr>
-          <w:rFonts w:ascii="Times New Roman" w:hAnsi="Times New Roman" w:cs="Times New Roman"/>
-          <w:sz w:val="28"/>
-          <w:lang w:eastAsia="ru-RU" w:bidi="ar-SA"/>
-        </w:rPr>
-      </w:pPr>
-      <w:hyperlink r:id="rId15" w:history="1">
-        <w:r>
-          <w:rPr>
-            <w:rStyle w:val="Hyperlink"/>
-            <w:rFonts w:ascii="Times New Roman" w:hAnsi="Times New Roman" w:cs="Times New Roman" w:hint="eastAsia"/>
-            <w:sz w:val="28"/>
-            <w:lang w:eastAsia="ru-RU" w:bidi="ar-SA"/>
-          </w:rPr>
-          <w:t>https://metanit.com/java/tutorial/3.3.php</w:t>
-        </w:r>
-      </w:hyperlink>
-    </w:p>
-    <w:p>
-      <w:pPr>
-        <w:pStyle w:val="ListParagraph"/>
-        <w:rPr>
-          <w:rFonts w:ascii="Times New Roman" w:hAnsi="Times New Roman" w:cs="Times New Roman"/>
-          <w:sz w:val="28"/>
-          <w:lang w:eastAsia="ru-RU" w:bidi="ar-SA"/>
-        </w:rPr>
-      </w:pPr>
-    </w:p>
-    <w:p>
-      <w:pPr>
-        <w:pStyle w:val="ListParagraph"/>
-        <w:numPr>
-          <w:ilvl w:val="0"/>
-          <w:numId w:val="5"/>
-        </w:numPr>
-        <w:rPr>
-          <w:rFonts w:ascii="Times New Roman" w:hAnsi="Times New Roman" w:cs="Times New Roman"/>
-          <w:sz w:val="28"/>
-          <w:lang w:eastAsia="ru-RU" w:bidi="ar-SA"/>
-        </w:rPr>
-      </w:pPr>
-      <w:r>
-        <w:rPr>
-          <w:rFonts w:ascii="Times New Roman" w:hAnsi="Times New Roman" w:cs="Times New Roman"/>
-          <w:sz w:val="28"/>
-          <w:lang w:val="en-US" w:eastAsia="ru-RU" w:bidi="ar-SA"/>
-        </w:rPr>
-        <w:t>JAVA</w:t>
-      </w:r>
-      <w:r>
-        <w:rPr>
-          <w:rFonts w:ascii="Times New Roman" w:hAnsi="Times New Roman" w:cs="Times New Roman"/>
-          <w:sz w:val="28"/>
-          <w:lang w:eastAsia="ru-RU" w:bidi="ar-SA"/>
-        </w:rPr>
-        <w:t xml:space="preserve"> </w:t>
-      </w:r>
-      <w:r>
-        <w:rPr>
-          <w:rFonts w:ascii="Times New Roman" w:hAnsi="Times New Roman" w:cs="Times New Roman"/>
-          <w:sz w:val="28"/>
-          <w:lang w:val="en-US" w:eastAsia="ru-RU" w:bidi="ar-SA"/>
-        </w:rPr>
-        <w:t>from</w:t>
-      </w:r>
-      <w:r>
-        <w:rPr>
-          <w:rFonts w:ascii="Times New Roman" w:hAnsi="Times New Roman" w:cs="Times New Roman"/>
-          <w:sz w:val="28"/>
-          <w:lang w:eastAsia="ru-RU" w:bidi="ar-SA"/>
-        </w:rPr>
-        <w:t xml:space="preserve"> </w:t>
-      </w:r>
-      <w:r>
-        <w:rPr>
-          <w:rFonts w:ascii="Times New Roman" w:hAnsi="Times New Roman" w:cs="Times New Roman"/>
-          <w:sz w:val="28"/>
-          <w:lang w:val="en-US" w:eastAsia="ru-RU" w:bidi="ar-SA"/>
-        </w:rPr>
-        <w:t>EPAM</w:t>
-      </w:r>
-      <w:r>
-        <w:rPr>
-          <w:rFonts w:ascii="Times New Roman" w:hAnsi="Times New Roman" w:cs="Times New Roman"/>
-          <w:sz w:val="28"/>
-          <w:lang w:eastAsia="ru-RU" w:bidi="ar-SA"/>
-        </w:rPr>
-        <w:t>, 2-</w:t>
-      </w:r>
-      <w:r>
-        <w:rPr>
-          <w:rFonts w:ascii="Times New Roman" w:hAnsi="Times New Roman" w:cs="Times New Roman"/>
-          <w:sz w:val="28"/>
-          <w:lang w:eastAsia="ru-RU" w:bidi="ar-SA"/>
-        </w:rPr>
-        <w:t>е</w:t>
-      </w:r>
-      <w:r>
-        <w:rPr>
-          <w:rFonts w:ascii="Times New Roman" w:hAnsi="Times New Roman" w:cs="Times New Roman"/>
-          <w:sz w:val="28"/>
-          <w:lang w:eastAsia="ru-RU" w:bidi="ar-SA"/>
-        </w:rPr>
-        <w:t xml:space="preserve"> </w:t>
-      </w:r>
-      <w:r>
-        <w:rPr>
-          <w:rFonts w:ascii="Times New Roman" w:hAnsi="Times New Roman" w:cs="Times New Roman"/>
-          <w:sz w:val="28"/>
-          <w:lang w:eastAsia="ru-RU" w:bidi="ar-SA"/>
-        </w:rPr>
-        <w:t>издание, исправленное. И. Н. Блинов, В. С. Романчук</w:t>
-      </w:r>
-    </w:p>
-    <w:p>
-      <w:pPr>
-        <w:pStyle w:val="ListParagraph"/>
-        <w:rPr>
-          <w:rFonts w:ascii="Times New Roman" w:hAnsi="Times New Roman" w:cs="Times New Roman"/>
-          <w:sz w:val="28"/>
-          <w:lang w:eastAsia="ru-RU" w:bidi="ar-SA"/>
-        </w:rPr>
-      </w:pPr>
-    </w:p>
-    <w:p>
-      <w:pPr>
-        <w:pStyle w:val="ListParagraph"/>
-        <w:numPr>
-          <w:ilvl w:val="0"/>
-          <w:numId w:val="5"/>
-        </w:numPr>
-        <w:rPr>
-          <w:rFonts w:ascii="Times New Roman" w:hAnsi="Times New Roman" w:cs="Times New Roman"/>
-          <w:sz w:val="28"/>
-          <w:lang w:eastAsia="ru-RU" w:bidi="ar-SA"/>
-        </w:rPr>
-      </w:pPr>
-      <w:hyperlink r:id="rId16" w:history="1">
-        <w:r>
-          <w:rPr>
-            <w:rStyle w:val="Hyperlink"/>
-            <w:rFonts w:ascii="Times New Roman" w:hAnsi="Times New Roman" w:cs="Times New Roman" w:hint="eastAsia"/>
-            <w:sz w:val="28"/>
-            <w:lang w:eastAsia="ru-RU" w:bidi="ar-SA"/>
-          </w:rPr>
-          <w:t>https://javarush.ru/groups/posts/1967-otnoshenija-mezhdu-klassami-nasledovanie-kompozicija-i-agregirovanie-</w:t>
-        </w:r>
-      </w:hyperlink>
-    </w:p>
-    <w:p>
-      <w:pPr>
-        <w:pStyle w:val="ListParagraph"/>
-        <w:rPr>
-          <w:rFonts w:ascii="Times New Roman" w:hAnsi="Times New Roman" w:cs="Times New Roman"/>
-          <w:sz w:val="28"/>
-          <w:lang w:eastAsia="ru-RU" w:bidi="ar-SA"/>
-        </w:rPr>
-      </w:pPr>
-    </w:p>
-    <w:p>
-      <w:pPr>
-        <w:pStyle w:val="ListParagraph"/>
-        <w:numPr>
-          <w:ilvl w:val="0"/>
-          <w:numId w:val="5"/>
-        </w:numPr>
-        <w:rPr>
-          <w:rFonts w:ascii="Times New Roman" w:hAnsi="Times New Roman" w:cs="Times New Roman"/>
-          <w:sz w:val="28"/>
-          <w:lang w:eastAsia="ru-RU" w:bidi="ar-SA"/>
-        </w:rPr>
-      </w:pPr>
-      <w:hyperlink r:id="rId17" w:history="1">
-        <w:r>
-          <w:rPr>
-            <w:rStyle w:val="Hyperlink"/>
-            <w:rFonts w:ascii="Times New Roman" w:hAnsi="Times New Roman" w:cs="Times New Roman" w:hint="eastAsia"/>
-            <w:sz w:val="28"/>
-            <w:lang w:eastAsia="ru-RU" w:bidi="ar-SA"/>
-          </w:rPr>
-          <w:t>https://javarush.ru/groups/posts/599-inicializacija-poley</w:t>
-        </w:r>
-      </w:hyperlink>
-    </w:p>
-    <w:p>
-      <w:pPr>
-        <w:pStyle w:val="ListParagraph"/>
-        <w:rPr>
-          <w:rFonts w:ascii="Times New Roman" w:hAnsi="Times New Roman" w:cs="Times New Roman"/>
-          <w:sz w:val="28"/>
-          <w:lang w:eastAsia="ru-RU" w:bidi="ar-SA"/>
-        </w:rPr>
-      </w:pPr>
-    </w:p>
-    <w:p>
-      <w:pPr>
-        <w:pStyle w:val="ListParagraph"/>
-        <w:numPr>
-          <w:ilvl w:val="0"/>
-          <w:numId w:val="5"/>
-        </w:numPr>
-        <w:rPr>
-          <w:rFonts w:ascii="Times New Roman" w:hAnsi="Times New Roman" w:cs="Times New Roman"/>
-          <w:sz w:val="28"/>
-          <w:lang w:eastAsia="ru-RU" w:bidi="ar-SA"/>
-        </w:rPr>
-      </w:pPr>
-      <w:r>
-        <w:rPr>
-          <w:rFonts w:ascii="Times New Roman" w:hAnsi="Times New Roman" w:cs="Times New Roman" w:hint="eastAsia"/>
-          <w:sz w:val="28"/>
-          <w:lang w:eastAsia="ru-RU" w:bidi="ar-SA"/>
-        </w:rPr>
-        <w:t>https://javarush.ru/groups/posts/2347-klass-string-v-java</w:t>
-      </w:r>
-    </w:p>
-    <w:p>
-      <w:pPr>
-        <w:rPr>
-          <w:rFonts w:ascii="Times New Roman" w:hAnsi="Times New Roman" w:cs="Times New Roman"/>
-          <w:sz w:val="28"/>
-          <w:lang w:eastAsia="ru-RU" w:bidi="ar-SA"/>
-        </w:rPr>
-      </w:pPr>
+        <w:shd w:val="clear" w:color="auto" w:fill="FFFFFF"/>
+        <w:spacing w:before="0" w:after="360" w:line="300" w:lineRule="atLeast"/>
+        <w:rPr>
+          <w:rFonts w:ascii="Arial" w:eastAsia="Times New Roman" w:hAnsi="Arial" w:cs="Arial"/>
+          <w:color w:val="494949"/>
+          <w:kern w:val="0"/>
+          <w:sz w:val="24"/>
+          <w:szCs w:val="24"/>
+          <w:lang w:eastAsia="en-GB" w:bidi="ar-SA"/>
+        </w:rPr>
+      </w:pPr>
+      <w:r>
+        <w:rPr>
+          <w:rFonts w:ascii="Arial" w:hAnsi="Arial" w:cs="Arial"/>
+          <w:color w:val="494949"/>
+          <w:sz w:val="24"/>
+          <w:szCs w:val="24"/>
+        </w:rPr>
+        <w:t>Java. Библиотека профессионала. Том 1. Основы</w:t>
+      </w:r>
     </w:p>
     <w:p>
       <w:pPr>
@@ -4327,6 +3665,155 @@
     </w:lvl>
   </w:abstractNum>
   <w:abstractNum w:abstractNumId="1" w15:restartNumberingAfterBreak="0">
+    <w:nsid w:val="022A3B26"/>
+    <w:multiLevelType w:val="multilevel"/>
+    <w:tmpl w:val="E48666F8"/>
+    <w:lvl w:ilvl="0">
+      <w:start w:val="1"/>
+      <w:numFmt w:val="bullet"/>
+      <w:lvlText w:val=""/>
+      <w:lvlJc w:val="left"/>
+      <w:pPr>
+        <w:tabs>
+          <w:tab w:val="num" w:pos="720"/>
+        </w:tabs>
+        <w:ind w:left="720" w:hanging="360"/>
+      </w:pPr>
+      <w:rPr>
+        <w:rFonts w:ascii="Symbol" w:hAnsi="Symbol" w:hint="default"/>
+        <w:sz w:val="20"/>
+      </w:rPr>
+    </w:lvl>
+    <w:lvl w:ilvl="1" w:tentative="1">
+      <w:start w:val="1"/>
+      <w:numFmt w:val="bullet"/>
+      <w:lvlText w:val="o"/>
+      <w:lvlJc w:val="left"/>
+      <w:pPr>
+        <w:tabs>
+          <w:tab w:val="num" w:pos="1440"/>
+        </w:tabs>
+        <w:ind w:left="1440" w:hanging="360"/>
+      </w:pPr>
+      <w:rPr>
+        <w:rFonts w:ascii="Courier New" w:hAnsi="Courier New" w:hint="default"/>
+        <w:sz w:val="20"/>
+      </w:rPr>
+    </w:lvl>
+    <w:lvl w:ilvl="2" w:tentative="1">
+      <w:start w:val="1"/>
+      <w:numFmt w:val="bullet"/>
+      <w:lvlText w:val=""/>
+      <w:lvlJc w:val="left"/>
+      <w:pPr>
+        <w:tabs>
+          <w:tab w:val="num" w:pos="2160"/>
+        </w:tabs>
+        <w:ind w:left="2160" w:hanging="360"/>
+      </w:pPr>
+      <w:rPr>
+        <w:rFonts w:ascii="Wingdings" w:hAnsi="Wingdings" w:hint="default"/>
+        <w:sz w:val="20"/>
+      </w:rPr>
+    </w:lvl>
+    <w:lvl w:ilvl="3" w:tentative="1">
+      <w:start w:val="1"/>
+      <w:numFmt w:val="bullet"/>
+      <w:lvlText w:val=""/>
+      <w:lvlJc w:val="left"/>
+      <w:pPr>
+        <w:tabs>
+          <w:tab w:val="num" w:pos="2880"/>
+        </w:tabs>
+        <w:ind w:left="2880" w:hanging="360"/>
+      </w:pPr>
+      <w:rPr>
+        <w:rFonts w:ascii="Wingdings" w:hAnsi="Wingdings" w:hint="default"/>
+        <w:sz w:val="20"/>
+      </w:rPr>
+    </w:lvl>
+    <w:lvl w:ilvl="4" w:tentative="1">
+      <w:start w:val="1"/>
+      <w:numFmt w:val="bullet"/>
+      <w:lvlText w:val=""/>
+      <w:lvlJc w:val="left"/>
+      <w:pPr>
+        <w:tabs>
+          <w:tab w:val="num" w:pos="3600"/>
+        </w:tabs>
+        <w:ind w:left="3600" w:hanging="360"/>
+      </w:pPr>
+      <w:rPr>
+        <w:rFonts w:ascii="Wingdings" w:hAnsi="Wingdings" w:hint="default"/>
+        <w:sz w:val="20"/>
+      </w:rPr>
+    </w:lvl>
+    <w:lvl w:ilvl="5" w:tentative="1">
+      <w:start w:val="1"/>
+      <w:numFmt w:val="bullet"/>
+      <w:lvlText w:val=""/>
+      <w:lvlJc w:val="left"/>
+      <w:pPr>
+        <w:tabs>
+          <w:tab w:val="num" w:pos="4320"/>
+        </w:tabs>
+        <w:ind w:left="4320" w:hanging="360"/>
+      </w:pPr>
+      <w:rPr>
+        <w:rFonts w:ascii="Wingdings" w:hAnsi="Wingdings" w:hint="default"/>
+        <w:sz w:val="20"/>
+      </w:rPr>
+    </w:lvl>
+    <w:lvl w:ilvl="6" w:tentative="1">
+      <w:start w:val="1"/>
+      <w:numFmt w:val="bullet"/>
+      <w:lvlText w:val=""/>
+      <w:lvlJc w:val="left"/>
+      <w:pPr>
+        <w:tabs>
+          <w:tab w:val="num" w:pos="5040"/>
+        </w:tabs>
+        <w:ind w:left="5040" w:hanging="360"/>
+      </w:pPr>
+      <w:rPr>
+        <w:rFonts w:ascii="Wingdings" w:hAnsi="Wingdings" w:hint="default"/>
+        <w:sz w:val="20"/>
+      </w:rPr>
+    </w:lvl>
+    <w:lvl w:ilvl="7" w:tentative="1">
+      <w:start w:val="1"/>
+      <w:numFmt w:val="bullet"/>
+      <w:lvlText w:val=""/>
+      <w:lvlJc w:val="left"/>
+      <w:pPr>
+        <w:tabs>
+          <w:tab w:val="num" w:pos="5760"/>
+        </w:tabs>
+        <w:ind w:left="5760" w:hanging="360"/>
+      </w:pPr>
+      <w:rPr>
+        <w:rFonts w:ascii="Wingdings" w:hAnsi="Wingdings" w:hint="default"/>
+        <w:sz w:val="20"/>
+      </w:rPr>
+    </w:lvl>
+    <w:lvl w:ilvl="8" w:tentative="1">
+      <w:start w:val="1"/>
+      <w:numFmt w:val="bullet"/>
+      <w:lvlText w:val=""/>
+      <w:lvlJc w:val="left"/>
+      <w:pPr>
+        <w:tabs>
+          <w:tab w:val="num" w:pos="6480"/>
+        </w:tabs>
+        <w:ind w:left="6480" w:hanging="360"/>
+      </w:pPr>
+      <w:rPr>
+        <w:rFonts w:ascii="Wingdings" w:hAnsi="Wingdings" w:hint="default"/>
+        <w:sz w:val="20"/>
+      </w:rPr>
+    </w:lvl>
+  </w:abstractNum>
+  <w:abstractNum w:abstractNumId="2" w15:restartNumberingAfterBreak="0">
     <w:nsid w:val="164F0728"/>
     <w:multiLevelType w:val="hybridMultilevel"/>
     <w:tmpl w:val="15A00E42"/>
@@ -4416,7 +3903,7 @@
       </w:pPr>
     </w:lvl>
   </w:abstractNum>
-  <w:abstractNum w:abstractNumId="2" w15:restartNumberingAfterBreak="0">
+  <w:abstractNum w:abstractNumId="3" w15:restartNumberingAfterBreak="0">
     <w:nsid w:val="5AA81D31"/>
     <w:multiLevelType w:val="multilevel"/>
     <w:tmpl w:val="3A183700"/>
@@ -4533,7 +4020,7 @@
       </w:pPr>
     </w:lvl>
   </w:abstractNum>
-  <w:abstractNum w:abstractNumId="3" w15:restartNumberingAfterBreak="0">
+  <w:abstractNum w:abstractNumId="4" w15:restartNumberingAfterBreak="0">
     <w:nsid w:val="66546C50"/>
     <w:multiLevelType w:val="hybridMultilevel"/>
     <w:tmpl w:val="62864AFA"/>
@@ -4623,7 +4110,7 @@
       </w:pPr>
     </w:lvl>
   </w:abstractNum>
-  <w:abstractNum w:abstractNumId="4" w15:restartNumberingAfterBreak="0">
+  <w:abstractNum w:abstractNumId="5" w15:restartNumberingAfterBreak="0">
     <w:nsid w:val="7E513FCD"/>
     <w:multiLevelType w:val="multilevel"/>
     <w:tmpl w:val="D6066530"/>
@@ -4776,16 +4263,19 @@
     <w:abstractNumId w:val="0"/>
   </w:num>
   <w:num w:numId="2" w16cid:durableId="369886892">
-    <w:abstractNumId w:val="1"/>
+    <w:abstractNumId w:val="2"/>
   </w:num>
   <w:num w:numId="3" w16cid:durableId="1158183165">
-    <w:abstractNumId w:val="2"/>
+    <w:abstractNumId w:val="3"/>
   </w:num>
   <w:num w:numId="4" w16cid:durableId="97603130">
+    <w:abstractNumId w:val="5"/>
+  </w:num>
+  <w:num w:numId="5" w16cid:durableId="1170677307">
     <w:abstractNumId w:val="4"/>
   </w:num>
-  <w:num w:numId="5" w16cid:durableId="1170677307">
-    <w:abstractNumId w:val="3"/>
+  <w:num w:numId="6" w16cid:durableId="1822966440">
+    <w:abstractNumId w:val="1"/>
   </w:num>
 </w:numbering>
 </file>

</xml_diff>